<commit_message>
Thêm giai đoạn 5
</commit_message>
<xml_diff>
--- a/Socket_TA.docx
+++ b/Socket_TA.docx
@@ -2239,6 +2239,7 @@
               <w:jc w:val="both"/>
               <w:rPr>
                 <w:rFonts w:hint="default" w:ascii="Times New Roman" w:hAnsi="Times New Roman" w:cs="Times New Roman"/>
+                <w:color w:val="FF0000"/>
               </w:rPr>
             </w:pPr>
             <w:r>
@@ -2246,7 +2247,7 @@
                 <w:rFonts w:hint="default" w:ascii="Times New Roman" w:hAnsi="Times New Roman" w:cs="Times New Roman"/>
                 <w:b/>
                 <w:bCs/>
-                <w:color w:val="1F3864"/>
+                <w:color w:val="FF0000"/>
                 <w:sz w:val="20"/>
                 <w:szCs w:val="20"/>
               </w:rPr>
@@ -2364,6 +2365,7 @@
               <w:jc w:val="both"/>
               <w:rPr>
                 <w:rFonts w:hint="default" w:ascii="Times New Roman" w:hAnsi="Times New Roman" w:cs="Times New Roman"/>
+                <w:color w:val="FF0000"/>
               </w:rPr>
             </w:pPr>
             <w:r>
@@ -2371,7 +2373,7 @@
                 <w:rFonts w:hint="default" w:ascii="Times New Roman" w:hAnsi="Times New Roman" w:cs="Times New Roman"/>
                 <w:b/>
                 <w:bCs/>
-                <w:color w:val="1F3864"/>
+                <w:color w:val="FF0000"/>
                 <w:sz w:val="20"/>
                 <w:szCs w:val="20"/>
               </w:rPr>
@@ -2489,6 +2491,7 @@
               <w:jc w:val="both"/>
               <w:rPr>
                 <w:rFonts w:hint="default" w:ascii="Times New Roman" w:hAnsi="Times New Roman" w:cs="Times New Roman"/>
+                <w:color w:val="FF0000"/>
               </w:rPr>
             </w:pPr>
             <w:r>
@@ -2496,7 +2499,7 @@
                 <w:rFonts w:hint="default" w:ascii="Times New Roman" w:hAnsi="Times New Roman" w:cs="Times New Roman"/>
                 <w:b/>
                 <w:bCs/>
-                <w:color w:val="1F3864"/>
+                <w:color w:val="FF0000"/>
                 <w:sz w:val="20"/>
                 <w:szCs w:val="20"/>
               </w:rPr>
@@ -2614,6 +2617,7 @@
               <w:jc w:val="both"/>
               <w:rPr>
                 <w:rFonts w:hint="default" w:ascii="Times New Roman" w:hAnsi="Times New Roman" w:cs="Times New Roman"/>
+                <w:color w:val="FF0000"/>
               </w:rPr>
             </w:pPr>
             <w:r>
@@ -2621,7 +2625,7 @@
                 <w:rFonts w:hint="default" w:ascii="Times New Roman" w:hAnsi="Times New Roman" w:cs="Times New Roman"/>
                 <w:b/>
                 <w:bCs/>
-                <w:color w:val="1F3864"/>
+                <w:color w:val="FF0000"/>
                 <w:sz w:val="20"/>
                 <w:szCs w:val="20"/>
               </w:rPr>
@@ -2739,6 +2743,7 @@
               <w:jc w:val="both"/>
               <w:rPr>
                 <w:rFonts w:hint="default" w:ascii="Times New Roman" w:hAnsi="Times New Roman" w:cs="Times New Roman"/>
+                <w:color w:val="FF0000"/>
               </w:rPr>
             </w:pPr>
             <w:r>
@@ -2746,7 +2751,7 @@
                 <w:rFonts w:hint="default" w:ascii="Times New Roman" w:hAnsi="Times New Roman" w:cs="Times New Roman"/>
                 <w:b/>
                 <w:bCs/>
-                <w:color w:val="1F3864"/>
+                <w:color w:val="FF0000"/>
                 <w:sz w:val="20"/>
                 <w:szCs w:val="20"/>
               </w:rPr>
@@ -2864,6 +2869,7 @@
               <w:jc w:val="both"/>
               <w:rPr>
                 <w:rFonts w:hint="default" w:ascii="Times New Roman" w:hAnsi="Times New Roman" w:cs="Times New Roman"/>
+                <w:color w:val="FF0000"/>
               </w:rPr>
             </w:pPr>
             <w:r>
@@ -2871,7 +2877,7 @@
                 <w:rFonts w:hint="default" w:ascii="Times New Roman" w:hAnsi="Times New Roman" w:cs="Times New Roman"/>
                 <w:b/>
                 <w:bCs/>
-                <w:color w:val="1F3864"/>
+                <w:color w:val="FF0000"/>
                 <w:sz w:val="20"/>
                 <w:szCs w:val="20"/>
               </w:rPr>
@@ -4019,7 +4025,20 @@
                 <w:sz w:val="20"/>
                 <w:szCs w:val="20"/>
               </w:rPr>
-              <w:t>STOR</w:t>
+              <w:t>STO</w:t>
+            </w:r>
+            <w:bookmarkStart w:id="0" w:name="_GoBack"/>
+            <w:bookmarkEnd w:id="0"/>
+            <w:r>
+              <w:rPr>
+                <w:rFonts w:hint="default" w:ascii="Times New Roman" w:hAnsi="Times New Roman" w:cs="Times New Roman"/>
+                <w:b/>
+                <w:bCs/>
+                <w:color w:val="FF0000"/>
+                <w:sz w:val="20"/>
+                <w:szCs w:val="20"/>
+              </w:rPr>
+              <w:t>R</w:t>
             </w:r>
           </w:p>
         </w:tc>
@@ -4135,6 +4154,7 @@
               <w:jc w:val="both"/>
               <w:rPr>
                 <w:rFonts w:hint="default" w:ascii="Times New Roman" w:hAnsi="Times New Roman" w:cs="Times New Roman"/>
+                <w:color w:val="FF0000"/>
               </w:rPr>
             </w:pPr>
             <w:r>
@@ -4142,7 +4162,7 @@
                 <w:rFonts w:hint="default" w:ascii="Times New Roman" w:hAnsi="Times New Roman" w:cs="Times New Roman"/>
                 <w:b/>
                 <w:bCs/>
-                <w:color w:val="1F3864"/>
+                <w:color w:val="FF0000"/>
                 <w:sz w:val="20"/>
                 <w:szCs w:val="20"/>
               </w:rPr>
@@ -4183,8 +4203,6 @@
               </w:rPr>
               <w:t>STOU</w:t>
             </w:r>
-            <w:bookmarkStart w:id="0" w:name="_GoBack"/>
-            <w:bookmarkEnd w:id="0"/>
           </w:p>
         </w:tc>
         <w:tc>
@@ -4262,6 +4280,7 @@
               <w:jc w:val="both"/>
               <w:rPr>
                 <w:rFonts w:hint="default" w:ascii="Times New Roman" w:hAnsi="Times New Roman" w:cs="Times New Roman"/>
+                <w:color w:val="FF0000"/>
               </w:rPr>
             </w:pPr>
             <w:r>
@@ -4269,7 +4288,7 @@
                 <w:rFonts w:hint="default" w:ascii="Times New Roman" w:hAnsi="Times New Roman" w:cs="Times New Roman"/>
                 <w:b/>
                 <w:bCs/>
-                <w:color w:val="1F3864"/>
+                <w:color w:val="FF0000"/>
                 <w:sz w:val="20"/>
                 <w:szCs w:val="20"/>
               </w:rPr>
@@ -4387,6 +4406,7 @@
               <w:jc w:val="both"/>
               <w:rPr>
                 <w:rFonts w:hint="default" w:ascii="Times New Roman" w:hAnsi="Times New Roman" w:cs="Times New Roman"/>
+                <w:color w:val="FF0000"/>
               </w:rPr>
             </w:pPr>
             <w:r>
@@ -4394,7 +4414,7 @@
                 <w:rFonts w:hint="default" w:ascii="Times New Roman" w:hAnsi="Times New Roman" w:cs="Times New Roman"/>
                 <w:b/>
                 <w:bCs/>
-                <w:color w:val="1F3864"/>
+                <w:color w:val="FF0000"/>
                 <w:sz w:val="20"/>
                 <w:szCs w:val="20"/>
               </w:rPr>
@@ -4512,6 +4532,7 @@
               <w:jc w:val="both"/>
               <w:rPr>
                 <w:rFonts w:hint="default" w:ascii="Times New Roman" w:hAnsi="Times New Roman" w:cs="Times New Roman"/>
+                <w:color w:val="FF0000"/>
               </w:rPr>
             </w:pPr>
             <w:r>
@@ -4519,7 +4540,7 @@
                 <w:rFonts w:hint="default" w:ascii="Times New Roman" w:hAnsi="Times New Roman" w:cs="Times New Roman"/>
                 <w:b/>
                 <w:bCs/>
-                <w:color w:val="1F3864"/>
+                <w:color w:val="FF0000"/>
                 <w:sz w:val="20"/>
                 <w:szCs w:val="20"/>
               </w:rPr>
@@ -4637,6 +4658,7 @@
               <w:jc w:val="both"/>
               <w:rPr>
                 <w:rFonts w:hint="default" w:ascii="Times New Roman" w:hAnsi="Times New Roman" w:cs="Times New Roman"/>
+                <w:color w:val="FF0000"/>
               </w:rPr>
             </w:pPr>
             <w:r>
@@ -4644,7 +4666,7 @@
                 <w:rFonts w:hint="default" w:ascii="Times New Roman" w:hAnsi="Times New Roman" w:cs="Times New Roman"/>
                 <w:b/>
                 <w:bCs/>
-                <w:color w:val="1F3864"/>
+                <w:color w:val="FF0000"/>
                 <w:sz w:val="20"/>
                 <w:szCs w:val="20"/>
               </w:rPr>
@@ -5019,7 +5041,7 @@
                 <w:rFonts w:hint="default" w:ascii="Times New Roman" w:hAnsi="Times New Roman" w:cs="Times New Roman"/>
                 <w:b/>
                 <w:bCs/>
-                <w:color w:val="1F3864"/>
+                <w:color w:val="FF0000"/>
                 <w:sz w:val="20"/>
                 <w:szCs w:val="20"/>
               </w:rPr>
@@ -6235,6 +6257,14 @@
       </w:tblGrid>
       <w:tr>
         <w:tblPrEx>
+          <w:tblBorders>
+            <w:top w:val="single" w:color="auto" w:sz="4" w:space="0"/>
+            <w:left w:val="single" w:color="auto" w:sz="4" w:space="0"/>
+            <w:bottom w:val="single" w:color="auto" w:sz="4" w:space="0"/>
+            <w:right w:val="single" w:color="auto" w:sz="4" w:space="0"/>
+            <w:insideH w:val="single" w:color="auto" w:sz="4" w:space="0"/>
+            <w:insideV w:val="single" w:color="auto" w:sz="4" w:space="0"/>
+          </w:tblBorders>
           <w:tblCellMar>
             <w:top w:w="0" w:type="dxa"/>
             <w:left w:w="10" w:type="dxa"/>

</xml_diff>